<commit_message>
Add enterprise readiness roadmap
</commit_message>
<xml_diff>
--- a/presentation/fraud-alert-control-tower-professional-project-report.docx
+++ b/presentation/fraud-alert-control-tower-professional-project-report.docx
@@ -3403,12 +3403,72 @@
       </w:pPr>
       <w:r>
         <w:rPr>
-          <w:rFonts w:ascii="Calibri" w:hAnsi="Calibri"/>
           <w:b/>
           <w:color w:val="064E49"/>
           <w:sz w:val="32"/>
         </w:rPr>
-        <w:t>10. Changes Made After Feedback</w:t>
+        <w:t>10. Enterprise Readiness Roadmap</w:t>
+      </w:r>
+    </w:p>
+    <w:p>
+      <w:pPr>
+        <w:spacing w:after="120"/>
+      </w:pPr>
+      <w:r>
+        <w:rPr>
+          <w:color w:val="142536"/>
+          <w:sz w:val="21"/>
+        </w:rPr>
+        <w:t>I compared the prototype with what a bank-grade fraud platform would require and separated the roadmap into three levels. This makes the limitation clear without weakening the project: the current version demonstrates the analyst workflow, while the next stages describe what would be needed for a controlled pilot and production approval.</w:t>
+      </w:r>
+    </w:p>
+    <w:p>
+      <w:pPr>
+        <w:spacing w:after="120"/>
+      </w:pPr>
+      <w:r>
+        <w:rPr>
+          <w:color w:val="142536"/>
+          <w:sz w:val="21"/>
+        </w:rPr>
+        <w:t>Prototype now: transaction scoring on synthetic data, risk tiers, investigator queue, local reason codes, threshold economics, CSV case export, and governance evidence.</w:t>
+      </w:r>
+    </w:p>
+    <w:p>
+      <w:pPr>
+        <w:spacing w:after="120"/>
+      </w:pPr>
+      <w:r>
+        <w:rPr>
+          <w:color w:val="142536"/>
+          <w:sz w:val="21"/>
+        </w:rPr>
+        <w:t>Controlled pilot: probability calibration against observed fraud rates, real SHAP explanations, segment validation by country/channel/amount band, investigator feedback capture, and weekly drift monitoring.</w:t>
+      </w:r>
+    </w:p>
+    <w:p>
+      <w:pPr>
+        <w:spacing w:after="120"/>
+      </w:pPr>
+      <w:r>
+        <w:rPr>
+          <w:color w:val="142536"/>
+          <w:sz w:val="21"/>
+        </w:rPr>
+        <w:t>Production requirements: live transaction streams, customer and account history, device and login behavior, graph/network fraud signals, role-based access, audit logging, security review, and formal model-risk approval.</w:t>
+      </w:r>
+    </w:p>
+    <w:p>
+      <w:pPr>
+        <w:spacing w:before="240" w:after="100"/>
+      </w:pPr>
+      <w:r>
+        <w:rPr>
+          <w:b/>
+          <w:color w:val="064E49"/>
+          <w:sz w:val="32"/>
+        </w:rPr>
+        <w:t>11. Changes Made After Feedback</w:t>
       </w:r>
     </w:p>
     <w:p>
@@ -3709,12 +3769,11 @@
       </w:pPr>
       <w:r>
         <w:rPr>
-          <w:rFonts w:ascii="Calibri" w:hAnsi="Calibri"/>
           <w:b/>
           <w:color w:val="064E49"/>
           <w:sz w:val="32"/>
         </w:rPr>
-        <w:t>11. Project Report Card</w:t>
+        <w:t>12. Project Report Card</w:t>
       </w:r>
     </w:p>
     <w:tbl>
@@ -4002,12 +4061,11 @@
       </w:pPr>
       <w:r>
         <w:rPr>
-          <w:rFonts w:ascii="Calibri" w:hAnsi="Calibri"/>
           <w:b/>
           <w:color w:val="064E49"/>
           <w:sz w:val="32"/>
         </w:rPr>
-        <w:t>12. Final Recommendation</w:t>
+        <w:t>13. Final Recommendation</w:t>
       </w:r>
     </w:p>
     <w:p>

</xml_diff>